<commit_message>
Add Zenodo DOI to data and code availability
Co-Authored-By: Claude Sonnet 5.5 <noreply@anthropic.com>
Claude-Session: https://claude.ai/code/session_01BZjJPdbxvnVxMrcgFoYMCh
</commit_message>
<xml_diff>
--- a/nmi_screening/NMI_Audit_Manuscript.docx
+++ b/nmi_screening/NMI_Audit_Manuscript.docx
@@ -3307,7 +3307,7 @@
           <w:b w:val="0"/>
           <w:i w:val="0"/>
         </w:rPr>
-        <w:t>Machine-generated papers, features, scores and result tables are in the replication package [Authors: deposit on Zenodo and give the DOI here]. Human papers are public (PubMed Central open access, arXiv) and are re-collected with the identifier list in the package.</w:t>
+        <w:t>Machine-generated papers, features, scores and result tables are in the replication package on Zenodo (https://doi.org/10.5281/zenodo.23664508). Human papers are public (PubMed Central open access, arXiv) and are re-collected with the identifier list in the package.</w:t>
       </w:r>
     </w:p>
     <w:p>
@@ -3332,7 +3332,7 @@
           <w:b w:val="0"/>
           <w:i w:val="0"/>
         </w:rPr>
-        <w:t>All code is in the replication package [DOI to be added].</w:t>
+        <w:t>All code is in the replication package on Zenodo (https://doi.org/10.5281/zenodo.23664508), released under the MIT licence.</w:t>
       </w:r>
     </w:p>
     <w:p>

</xml_diff>

<commit_message>
Fill author, affiliation, contributions and AI disclosure
Co-Authored-By: Claude Sonnet 5.5 <noreply@anthropic.com>
Claude-Session: https://claude.ai/code/session_01BZjJPdbxvnVxMrcgFoYMCh
</commit_message>
<xml_diff>
--- a/nmi_screening/NMI_Audit_Manuscript.docx
+++ b/nmi_screening/NMI_Audit_Manuscript.docx
@@ -27,7 +27,47 @@
           <w:i w:val="0"/>
           <w:sz w:val="22"/>
         </w:rPr>
-        <w:t>[Authors, affiliations and corresponding author to be completed]</w:t>
+        <w:t>Ook Lee</w:t>
+      </w:r>
+      <w:r>
+        <w:rPr>
+          <w:b w:val="0"/>
+          <w:i w:val="0"/>
+          <w:sz w:val="22"/>
+          <w:vertAlign w:val="superscript"/>
+        </w:rPr>
+        <w:t>1</w:t>
+      </w:r>
+      <w:r>
+        <w:rPr>
+          <w:b w:val="0"/>
+          <w:i w:val="0"/>
+          <w:sz w:val="22"/>
+        </w:rPr>
+        <w:t>*</w:t>
+      </w:r>
+    </w:p>
+    <w:p>
+      <w:pPr>
+        <w:spacing w:line="276" w:lineRule="auto" w:after="200" w:before="0"/>
+        <w:jc w:val="center"/>
+      </w:pPr>
+      <w:r>
+        <w:rPr>
+          <w:b w:val="0"/>
+          <w:i w:val="0"/>
+          <w:sz w:val="20"/>
+          <w:vertAlign w:val="superscript"/>
+        </w:rPr>
+        <w:t>1</w:t>
+      </w:r>
+      <w:r>
+        <w:rPr>
+          <w:b w:val="0"/>
+          <w:i w:val="0"/>
+          <w:sz w:val="20"/>
+        </w:rPr>
+        <w:t>Hanyang University, Seoul, Republic of Korea. *Corresponding author: ooklee@hanyang.ac.kr</w:t>
       </w:r>
     </w:p>
     <w:p>
@@ -3357,7 +3397,7 @@
           <w:b w:val="0"/>
           <w:i w:val="0"/>
         </w:rPr>
-        <w:t>[To be completed.]</w:t>
+        <w:t>O.L. conceived and designed the study, built the corpus and the analysis pipeline, interpreted the results and wrote the manuscript.</w:t>
       </w:r>
     </w:p>
     <w:p>
@@ -3382,7 +3422,7 @@
           <w:b w:val="0"/>
           <w:i w:val="0"/>
         </w:rPr>
-        <w:t>[To be completed. Describe any use of generative AI tools in preparing the manuscript, code or analysis, as the journal's policy requires.]</w:t>
+        <w:t>[Author to confirm: the author declares no competing interests.] Generative AI disclosure: the machine-written papers studied here were produced by GPT-4o, Claude Sonnet 5.5 and Llama 3.3 70B Instruct, and Gemini 2.5 Pro served as a judge. An AI coding assistant (Claude Code) was used to write and run the analysis code and to draft and edit the manuscript text; the author reviewed the results and takes responsibility for the content.</w:t>
       </w:r>
     </w:p>
     <w:p>

</xml_diff>

<commit_message>
Expand NMI manuscript: related work, verified references, corpus table, edit-strength analysis, controls figure, discussion
Co-Authored-By: Claude Sonnet 5.5 <noreply@anthropic.com>
Claude-Session: https://claude.ai/code/session_01BZjJPdbxvnVxMrcgFoYMCh
</commit_message>
<xml_diff>
--- a/nmi_screening/NMI_Audit_Manuscript.docx
+++ b/nmi_screening/NMI_Audit_Manuscript.docx
@@ -126,6 +126,123 @@
           <w:i w:val="0"/>
         </w:rPr>
         <w:t>. A deployed screen faces two further problems: new generators appear continually, and an author who knows how papers are screened can edit the text. Both problems are under-measured. Cross-generator transfer is rarely reported, adaptive authors are usually limited to paraphrasing, and screens that use hand-countable features, which an editor can inspect and explain, are seldom compared with published detectors.</w:t>
+      </w:r>
+    </w:p>
+    <w:p>
+      <w:pPr>
+        <w:spacing w:after="0" w:before="0"/>
+      </w:pPr>
+      <w:r>
+        <w:rPr>
+          <w:b w:val="0"/>
+          <w:i w:val="0"/>
+        </w:rPr>
+        <w:t>Prior evaluations point to several weaknesses. Detectors lose accuracy under paraphrasing</w:t>
+      </w:r>
+      <w:r>
+        <w:rPr>
+          <w:b w:val="0"/>
+          <w:i w:val="0"/>
+          <w:vertAlign w:val="superscript"/>
+        </w:rPr>
+        <w:t>3,4</w:t>
+      </w:r>
+      <w:r>
+        <w:rPr>
+          <w:b w:val="0"/>
+          <w:i w:val="0"/>
+        </w:rPr>
+        <w:t>, on generators and domains absent from their training data</w:t>
+      </w:r>
+      <w:r>
+        <w:rPr>
+          <w:b w:val="0"/>
+          <w:i w:val="0"/>
+          <w:vertAlign w:val="superscript"/>
+        </w:rPr>
+        <w:t>5,6</w:t>
+      </w:r>
+      <w:r>
+        <w:rPr>
+          <w:b w:val="0"/>
+          <w:i w:val="0"/>
+        </w:rPr>
+        <w:t>, and can be biased against non-native writers</w:t>
+      </w:r>
+      <w:r>
+        <w:rPr>
+          <w:b w:val="0"/>
+          <w:i w:val="0"/>
+          <w:vertAlign w:val="superscript"/>
+        </w:rPr>
+        <w:t>7</w:t>
+      </w:r>
+      <w:r>
+        <w:rPr>
+          <w:b w:val="0"/>
+          <w:i w:val="0"/>
+        </w:rPr>
+        <w:t>. Watermarking</w:t>
+      </w:r>
+      <w:r>
+        <w:rPr>
+          <w:b w:val="0"/>
+          <w:i w:val="0"/>
+          <w:vertAlign w:val="superscript"/>
+        </w:rPr>
+        <w:t>8</w:t>
+      </w:r>
+      <w:r>
+        <w:rPr>
+          <w:b w:val="0"/>
+          <w:i w:val="0"/>
+        </w:rPr>
+        <w:t xml:space="preserve"> avoids detection altogether but needs the cooperation of every generator and is itself vulnerable to paraphrasing</w:t>
+      </w:r>
+      <w:r>
+        <w:rPr>
+          <w:b w:val="0"/>
+          <w:i w:val="0"/>
+          <w:vertAlign w:val="superscript"/>
+        </w:rPr>
+        <w:t>3</w:t>
+      </w:r>
+      <w:r>
+        <w:rPr>
+          <w:b w:val="0"/>
+          <w:i w:val="0"/>
+        </w:rPr>
+        <w:t>. The stakes are not hypothetical: corpus-level estimates suggest that a growing share of scientific papers already show signs of LLM modification</w:t>
+      </w:r>
+      <w:r>
+        <w:rPr>
+          <w:b w:val="0"/>
+          <w:i w:val="0"/>
+          <w:vertAlign w:val="superscript"/>
+        </w:rPr>
+        <w:t>9</w:t>
+      </w:r>
+      <w:r>
+        <w:rPr>
+          <w:b w:val="0"/>
+          <w:i w:val="0"/>
+        </w:rPr>
+        <w:t>. Lightweight classifiers on hand-designed features have been proposed as a cheap first line of defence</w:t>
+      </w:r>
+      <w:r>
+        <w:rPr>
+          <w:b w:val="0"/>
+          <w:i w:val="0"/>
+          <w:vertAlign w:val="superscript"/>
+        </w:rPr>
+        <w:t>10</w:t>
+      </w:r>
+      <w:r>
+        <w:rPr>
+          <w:b w:val="0"/>
+          <w:i w:val="0"/>
+        </w:rPr>
+        <w:t>, but they are rarely compared with probability-based and supervised detectors under attack. Existing benchmarks cover paraphrasing and unseen generators; they do not combine attacks aimed at the detector's own score (sentence mixing, noise) with a control for structural artifacts in the corpora, which is the gap this audit addresses.</w:t>
       </w:r>
     </w:p>
     <w:p>
@@ -2247,6 +2364,73 @@
           <w:b/>
           <w:i/>
         </w:rPr>
+        <w:t>Edit strength acts gradually on the count screen and barely on the other detectors</w:t>
+      </w:r>
+    </w:p>
+    <w:p>
+      <w:pPr>
+        <w:spacing w:after="0" w:before="0"/>
+      </w:pPr>
+      <w:r>
+        <w:rPr>
+          <w:b w:val="0"/>
+          <w:i w:val="0"/>
+        </w:rPr>
+        <w:t xml:space="preserve">The feature edit moves counts a share </w:t>
+      </w:r>
+      <w:r>
+        <w:rPr>
+          <w:b w:val="0"/>
+          <w:i/>
+        </w:rPr>
+        <w:t>e</w:t>
+      </w:r>
+      <w:r>
+        <w:rPr>
+          <w:b w:val="0"/>
+          <w:i w:val="0"/>
+        </w:rPr>
+        <w:t xml:space="preserve"> of the way toward the human mean. The count screen declines steadily with </w:t>
+      </w:r>
+      <w:r>
+        <w:rPr>
+          <w:b w:val="0"/>
+          <w:i/>
+        </w:rPr>
+        <w:t>e</w:t>
+      </w:r>
+      <w:r>
+        <w:rPr>
+          <w:b w:val="0"/>
+          <w:i w:val="0"/>
+        </w:rPr>
+        <w:t xml:space="preserve"> (AUC for the baseline screen, </w:t>
+      </w:r>
+      <w:r>
+        <w:rPr>
+          <w:b w:val="0"/>
+          <w:i/>
+        </w:rPr>
+        <w:t>e</w:t>
+      </w:r>
+      <w:r>
+        <w:rPr>
+          <w:b w:val="0"/>
+          <w:i w:val="0"/>
+        </w:rPr>
+        <w:t xml:space="preserve"> = 0, 0.25, 0.5, 0.75, 1: Claude 0.78/0.75/0.71/0.70/0.67; GPT-4o 0.85/0.82/0.79/0.76/0.71; Llama 0.84/0.79/0.73/0.71/0.64), a loss roughly proportional to effort that reaches 0.11 to 0.21 AUC at full effort. Fast-DetectGPT and the classifiers change by less than 0.06 at full effort. This is what one expects when an attack targets the features of one detector and not another's: the edit moves counts that the count screen uses, but leaves the word choices and the probability structure on which the other detectors rely. A hybrid that rewrites first and then edits (Supplementary Table 1 to 3) is stronger than the edit alone against the count screen for GPT-4o papers and no stronger for the others.</w:t>
+      </w:r>
+    </w:p>
+    <w:p>
+      <w:pPr>
+        <w:keepNext/>
+        <w:spacing w:line="276" w:lineRule="auto" w:after="80" w:before="160"/>
+      </w:pPr>
+      <w:r>
+        <w:rPr>
+          <w:b/>
+          <w:i/>
+        </w:rPr>
         <w:t>Probability scores invert under perturbation</w:t>
       </w:r>
     </w:p>
@@ -2260,6 +2444,100 @@
           <w:i w:val="0"/>
         </w:rPr>
         <w:t>Log-likelihood and entropy fall below chance for perturbed text: for Claude papers with half of the sentences replaced by human sentences, the AUC of log-likelihood is 0.05 and that of entropy 0.03. This is not a scoring error. The perturbed text is less probable than genuine human text (mean log-likelihood per token -2.72 against -2.04) because spliced sentences break coherence and typos lower probability, so a rule that calls high-probability text machine-written labels perturbed text human. A two-sided score, the absolute deviation from the human median, recovers detection (log-likelihood 0.90, entropy 0.94; for GPT-4o papers 0.12 against 0.75). The deviation threshold was set on the same human papers, so these are optimistic, but it shows that an author who wants to pass a one-sided probability detector can overshoot, and that a defender can look for text that is too improbable as well as too probable. Fast-DetectGPT, which normalizes by the curvature of the model's own distribution, does not invert.</w:t>
+      </w:r>
+    </w:p>
+    <w:p>
+      <w:pPr>
+        <w:keepNext/>
+        <w:spacing w:before="160"/>
+        <w:jc w:val="center"/>
+      </w:pPr>
+      <w:r>
+        <w:drawing>
+          <wp:inline xmlns:a="http://schemas.openxmlformats.org/drawingml/2006/main" xmlns:pic="http://schemas.openxmlformats.org/drawingml/2006/picture">
+            <wp:extent cx="5760720" cy="2048256"/>
+            <wp:docPr id="2" name="Picture 2"/>
+            <wp:cNvGraphicFramePr>
+              <a:graphicFrameLocks noChangeAspect="1"/>
+            </wp:cNvGraphicFramePr>
+            <a:graphic>
+              <a:graphicData uri="http://schemas.openxmlformats.org/drawingml/2006/picture">
+                <pic:pic>
+                  <pic:nvPicPr>
+                    <pic:cNvPr id="0" name="fig_audit2.png"/>
+                    <pic:cNvPicPr/>
+                  </pic:nvPicPr>
+                  <pic:blipFill>
+                    <a:blip r:embed="rId12"/>
+                    <a:stretch>
+                      <a:fillRect/>
+                    </a:stretch>
+                  </pic:blipFill>
+                  <pic:spPr>
+                    <a:xfrm>
+                      <a:off x="0" y="0"/>
+                      <a:ext cx="5760720" cy="2048256"/>
+                    </a:xfrm>
+                    <a:prstGeom prst="rect"/>
+                  </pic:spPr>
+                </pic:pic>
+              </a:graphicData>
+            </a:graphic>
+          </wp:inline>
+        </w:drawing>
+      </w:r>
+    </w:p>
+    <w:p>
+      <w:pPr>
+        <w:spacing w:line="240" w:lineRule="auto" w:after="200" w:before="40"/>
+      </w:pPr>
+      <w:r>
+        <w:rPr>
+          <w:b/>
+          <w:i w:val="0"/>
+          <w:sz w:val="20"/>
+        </w:rPr>
+        <w:t>Fig. 2 | Two controls.</w:t>
+      </w:r>
+      <w:r>
+        <w:rPr>
+          <w:b w:val="0"/>
+          <w:i w:val="0"/>
+          <w:sz w:val="20"/>
+        </w:rPr>
+        <w:t xml:space="preserve"> </w:t>
+      </w:r>
+      <w:r>
+        <w:rPr>
+          <w:b/>
+          <w:i w:val="0"/>
+          <w:sz w:val="20"/>
+        </w:rPr>
+        <w:t>a</w:t>
+      </w:r>
+      <w:r>
+        <w:rPr>
+          <w:b w:val="0"/>
+          <w:i w:val="0"/>
+          <w:sz w:val="20"/>
+        </w:rPr>
+        <w:t xml:space="preserve">, AUC of one-sided and two-sided probability scores for Claude and GPT-4o papers with half of the sentences replaced by human sentences (two-sided: absolute deviation from the human median). </w:t>
+      </w:r>
+      <w:r>
+        <w:rPr>
+          <w:b/>
+          <w:i w:val="0"/>
+          <w:sz w:val="20"/>
+        </w:rPr>
+        <w:t>b</w:t>
+      </w:r>
+      <w:r>
+        <w:rPr>
+          <w:b w:val="0"/>
+          <w:i w:val="0"/>
+          <w:sz w:val="20"/>
+        </w:rPr>
+        <w:t>, AUC of the TF-IDF classifier on an unseen generator for three versions of the input text.</w:t>
       </w:r>
     </w:p>
     <w:p>
@@ -3127,6 +3405,42 @@
           <w:b w:val="0"/>
           <w:i w:val="0"/>
         </w:rPr>
+        <w:t>These results suggest a short checklist for evaluating a machine-text detector: report accuracy on a generator that played no part in training; include at least one attack that targets the detector's own score and not only paraphrasing; check whether a high score survives removal of structural artifacts; and, for probability-based scores, test a two-sided rule. Our data show each item changing a conclusion: Claude papers separate the detectors that look alike on other generators, sentence mixing separates detectors that look alike under paraphrasing, and artifact removal separates TF-IDF from the other supervised detector on unseen generators.</w:t>
+      </w:r>
+    </w:p>
+    <w:p>
+      <w:pPr>
+        <w:spacing w:after="0" w:before="0"/>
+      </w:pPr>
+      <w:r>
+        <w:rPr>
+          <w:b w:val="0"/>
+          <w:i w:val="0"/>
+        </w:rPr>
+        <w:t>Claude papers are the hardest for every method, and the reason is not established by our data. Candidate explanations are that the model's output is less predictable under the open model used for probability scores, that its prose contains more of the features human authors use, or that it was generated with a reasoning mode that changes style. We did not test them, and a ranking of generators by difficulty is probably not stable across prompts and genres. What the audit does show is that a screen validated on one or two generators can fail on a third in ways that headline accuracy hides, which is the practical case for a held-out generator in every evaluation.</w:t>
+      </w:r>
+    </w:p>
+    <w:p>
+      <w:pPr>
+        <w:spacing w:after="0" w:before="0"/>
+      </w:pPr>
+      <w:r>
+        <w:rPr>
+          <w:b w:val="0"/>
+          <w:i w:val="0"/>
+        </w:rPr>
+        <w:t>The judge deserves a separate caution. It reads an excerpt and gives a probability, and part of its strength under mixing comes from incoherence that a careful author would not produce; an attacker who mixes sentences from a single related source, or who repairs coherence with a rewrite after mixing, might not be caught. The GPT-4o judge also evaluates text from its own family, and its verdicts on GPT-4o papers involve self-recognition. Neither issue was tested here.</w:t>
+      </w:r>
+    </w:p>
+    <w:p>
+      <w:pPr>
+        <w:spacing w:after="0" w:before="0"/>
+      </w:pPr>
+      <w:r>
+        <w:rPr>
+          <w:b w:val="0"/>
+          <w:i w:val="0"/>
+        </w:rPr>
         <w:t>The transparent count screen did not match published detectors, so we do not claim it as a better detector. Its case rests on explanation and on cost: every feature can be shown to an author or a committee, and scoring a document takes milliseconds. Clustering features helped on unseen generators. Whether explainability is worth the lost accuracy is a policy question that this audit does not answer.</w:t>
       </w:r>
     </w:p>
@@ -3139,7 +3453,7 @@
           <w:b w:val="0"/>
           <w:i w:val="0"/>
         </w:rPr>
-        <w:t>The limits are substantial. The study covers three generators, one genre (English-language scientific papers), 100 attacked papers per generator and cell, so AUC differences below about 0.05 are within sampling error, and 200 human negatives. The Gemini judge was run on four attacks and on mixing for 263 of the 300 papers because of a spending cap. Machine papers were generated in four requests from the title and abstract of a real paper, human papers come from two extraction pipelines, and both facts create artifacts that we only partly controlled. The attackers are simple: none optimizes against a detector's gradient, uses a paraphraser trained against detectors or edits at the token level with a surrogate. Zero-shot detectors used one open model pair (Falcon-7B and its instruct version). We did not test light human editing of machine text or the use of detectors on mixed human–machine documents, and the economic questions of base rates and review costs are not addressed here.</w:t>
+        <w:t>The limits are substantial. The study covers three generators, one genre (English-language scientific papers), 100 attacked papers per generator and cell, so AUC differences below about 0.07 are within sampling error (Methods), and 200 human negatives. The Gemini judge was run on four attacks and on mixing for 263 of the 300 papers because of a spending cap. Machine papers were generated in four requests from the title and abstract of a real paper, human papers come from two extraction pipelines, and both facts create artifacts that we only partly controlled. The attackers are simple: none optimizes against a detector's gradient, uses a paraphraser trained against detectors or edits at the token level with a surrogate. Zero-shot detectors used one open model pair (Falcon-7B and its instruct version). We did not test light human editing of machine text or the use of detectors on mixed human–machine documents, and the economic questions of base rates and review costs are not addressed here.</w:t>
       </w:r>
     </w:p>
     <w:p>
@@ -3177,7 +3491,486 @@
           <w:b w:val="0"/>
           <w:i w:val="0"/>
         </w:rPr>
-        <w:t>Human papers were sampled at random from 2015 to 2019, before large language models were widely used for scientific writing: 300 from the open-access subset of PubMed Central (article XML body text) and 200 from arXiv (PDFs converted to text, reference lists removed, broken lines rejoined). Documents under 1,500 words were excluded, leaving 474 human papers. For each sampled paper a generator wrote a paper on the same topic from the original title and abstract, with one of three prompts of increasing detail; we used GPT-4o, Claude Sonnet 5.5 and Llama 3.3 70B Instruct through a commercial gateway, with each paper written in four requests (introduction, methods, results, discussion) and concatenated. The corpus has 245 GPT-4o, 151 Claude and 202 Llama papers (Claude was capped to limit cost). Every document was truncated to its first 2,000 whitespace-delimited tokens.</w:t>
+        <w:t>We sampled 500 human papers at random from 2015 to 2019, before large language models were widely used for scientific writing: 330 from the open-access subset of PubMed Central (article XML body text) and 170 from arXiv (PDFs converted to text, reference lists removed, broken lines rejoined). We kept papers with at least 1,500 words, a title and an abstract. Features need four 500-token windows, so papers with fewer than 2,000 tokens after cleaning were dropped from the analysis, leaving 474 human papers (309 PubMed Central, 165 arXiv; median length 4,299 words before truncation). For each sampled paper a generator wrote a paper on the same topic from the original title and abstract, with one of three prompts of increasing detail (temperature 0.7), through a commercial gateway. Each paper was written in four requests (introduction, methods, results, discussion with conclusion) and concatenated. Every document was truncated to its first 2,000 whitespace-delimited tokens (Table 4).</w:t>
+      </w:r>
+    </w:p>
+    <w:p>
+      <w:pPr>
+        <w:keepNext/>
+        <w:spacing w:line="276" w:lineRule="auto" w:after="80" w:before="200"/>
+      </w:pPr>
+      <w:r>
+        <w:rPr>
+          <w:b/>
+          <w:i w:val="0"/>
+        </w:rPr>
+        <w:t>Table 4 | Corpus.</w:t>
+      </w:r>
+      <w:r>
+        <w:rPr>
+          <w:b w:val="0"/>
+          <w:i w:val="0"/>
+        </w:rPr>
+        <w:t xml:space="preserve"> Documents per source before truncation.</w:t>
+      </w:r>
+    </w:p>
+    <w:tbl>
+      <w:tblPr>
+        <w:tblW w:type="auto" w:w="0"/>
+        <w:jc w:val="center"/>
+        <w:tblLook w:firstColumn="1" w:firstRow="1" w:lastColumn="0" w:lastRow="0" w:noHBand="0" w:noVBand="1" w:val="04A0"/>
+      </w:tblPr>
+      <w:tblGrid>
+        <w:gridCol w:w="2340"/>
+        <w:gridCol w:w="2340"/>
+        <w:gridCol w:w="2340"/>
+        <w:gridCol w:w="2340"/>
+      </w:tblGrid>
+      <w:tr>
+        <w:tc>
+          <w:tcPr>
+            <w:tcW w:type="dxa" w:w="3168"/>
+            <w:tcBorders>
+              <w:top w:val="single" w:sz="12" w:color="000000"/>
+              <w:bottom w:val="single" w:sz="6" w:color="000000"/>
+            </w:tcBorders>
+          </w:tcPr>
+          <w:p>
+            <w:pPr>
+              <w:spacing w:line="240" w:lineRule="auto" w:after="20" w:before="20"/>
+            </w:pPr>
+            <w:r/>
+            <w:r>
+              <w:rPr>
+                <w:b/>
+                <w:i w:val="0"/>
+                <w:sz w:val="18"/>
+              </w:rPr>
+              <w:t>Source</w:t>
+            </w:r>
+          </w:p>
+        </w:tc>
+        <w:tc>
+          <w:tcPr>
+            <w:tcW w:type="dxa" w:w="2736"/>
+            <w:tcBorders>
+              <w:top w:val="single" w:sz="12" w:color="000000"/>
+              <w:bottom w:val="single" w:sz="6" w:color="000000"/>
+            </w:tcBorders>
+          </w:tcPr>
+          <w:p>
+            <w:pPr>
+              <w:spacing w:line="240" w:lineRule="auto" w:after="20" w:before="20"/>
+              <w:jc w:val="center"/>
+            </w:pPr>
+            <w:r/>
+            <w:r>
+              <w:rPr>
+                <w:b/>
+                <w:i w:val="0"/>
+                <w:sz w:val="18"/>
+              </w:rPr>
+              <w:t>Documents</w:t>
+            </w:r>
+          </w:p>
+        </w:tc>
+        <w:tc>
+          <w:tcPr>
+            <w:tcW w:type="dxa" w:w="1728"/>
+            <w:tcBorders>
+              <w:top w:val="single" w:sz="12" w:color="000000"/>
+              <w:bottom w:val="single" w:sz="6" w:color="000000"/>
+            </w:tcBorders>
+          </w:tcPr>
+          <w:p>
+            <w:pPr>
+              <w:spacing w:line="240" w:lineRule="auto" w:after="20" w:before="20"/>
+              <w:jc w:val="center"/>
+            </w:pPr>
+            <w:r/>
+            <w:r>
+              <w:rPr>
+                <w:b/>
+                <w:i w:val="0"/>
+                <w:sz w:val="18"/>
+              </w:rPr>
+              <w:t>Median words</w:t>
+            </w:r>
+          </w:p>
+        </w:tc>
+        <w:tc>
+          <w:tcPr>
+            <w:tcW w:type="dxa" w:w="2304"/>
+            <w:tcBorders>
+              <w:top w:val="single" w:sz="12" w:color="000000"/>
+              <w:bottom w:val="single" w:sz="6" w:color="000000"/>
+            </w:tcBorders>
+          </w:tcPr>
+          <w:p>
+            <w:pPr>
+              <w:spacing w:line="240" w:lineRule="auto" w:after="20" w:before="20"/>
+              <w:jc w:val="center"/>
+            </w:pPr>
+            <w:r/>
+            <w:r>
+              <w:rPr>
+                <w:b/>
+                <w:i w:val="0"/>
+                <w:sz w:val="18"/>
+              </w:rPr>
+              <w:t>10th–90th percentile</w:t>
+            </w:r>
+          </w:p>
+        </w:tc>
+      </w:tr>
+      <w:tr>
+        <w:tc>
+          <w:tcPr>
+            <w:tcW w:type="dxa" w:w="3168"/>
+          </w:tcPr>
+          <w:p>
+            <w:pPr>
+              <w:spacing w:line="240" w:lineRule="auto" w:after="20" w:before="20"/>
+            </w:pPr>
+            <w:r/>
+            <w:r>
+              <w:rPr>
+                <w:b w:val="0"/>
+                <w:i w:val="0"/>
+                <w:sz w:val="18"/>
+              </w:rPr>
+              <w:t>Human (PubMed Central, arXiv)</w:t>
+            </w:r>
+          </w:p>
+        </w:tc>
+        <w:tc>
+          <w:tcPr>
+            <w:tcW w:type="dxa" w:w="2736"/>
+          </w:tcPr>
+          <w:p>
+            <w:pPr>
+              <w:spacing w:line="240" w:lineRule="auto" w:after="20" w:before="20"/>
+              <w:jc w:val="center"/>
+            </w:pPr>
+            <w:r/>
+            <w:r>
+              <w:rPr>
+                <w:b w:val="0"/>
+                <w:i w:val="0"/>
+                <w:sz w:val="18"/>
+              </w:rPr>
+              <w:t>474 analysed (500 collected)</w:t>
+            </w:r>
+          </w:p>
+        </w:tc>
+        <w:tc>
+          <w:tcPr>
+            <w:tcW w:type="dxa" w:w="1728"/>
+          </w:tcPr>
+          <w:p>
+            <w:pPr>
+              <w:spacing w:line="240" w:lineRule="auto" w:after="20" w:before="20"/>
+              <w:jc w:val="center"/>
+            </w:pPr>
+            <w:r/>
+            <w:r>
+              <w:rPr>
+                <w:b w:val="0"/>
+                <w:i w:val="0"/>
+                <w:sz w:val="18"/>
+              </w:rPr>
+              <w:t>4,299</w:t>
+            </w:r>
+          </w:p>
+        </w:tc>
+        <w:tc>
+          <w:tcPr>
+            <w:tcW w:type="dxa" w:w="2304"/>
+          </w:tcPr>
+          <w:p>
+            <w:pPr>
+              <w:spacing w:line="240" w:lineRule="auto" w:after="20" w:before="20"/>
+              <w:jc w:val="center"/>
+            </w:pPr>
+            <w:r/>
+            <w:r>
+              <w:rPr>
+                <w:b w:val="0"/>
+                <w:i w:val="0"/>
+                <w:sz w:val="18"/>
+              </w:rPr>
+              <w:t>2,294–8,876</w:t>
+            </w:r>
+          </w:p>
+        </w:tc>
+      </w:tr>
+      <w:tr>
+        <w:tc>
+          <w:tcPr>
+            <w:tcW w:type="dxa" w:w="3168"/>
+          </w:tcPr>
+          <w:p>
+            <w:pPr>
+              <w:spacing w:line="240" w:lineRule="auto" w:after="20" w:before="20"/>
+            </w:pPr>
+            <w:r/>
+            <w:r>
+              <w:rPr>
+                <w:b w:val="0"/>
+                <w:i w:val="0"/>
+                <w:sz w:val="18"/>
+              </w:rPr>
+              <w:t>GPT-4o</w:t>
+            </w:r>
+          </w:p>
+        </w:tc>
+        <w:tc>
+          <w:tcPr>
+            <w:tcW w:type="dxa" w:w="2736"/>
+          </w:tcPr>
+          <w:p>
+            <w:pPr>
+              <w:spacing w:line="240" w:lineRule="auto" w:after="20" w:before="20"/>
+              <w:jc w:val="center"/>
+            </w:pPr>
+            <w:r/>
+            <w:r>
+              <w:rPr>
+                <w:b w:val="0"/>
+                <w:i w:val="0"/>
+                <w:sz w:val="18"/>
+              </w:rPr>
+              <w:t>245</w:t>
+            </w:r>
+          </w:p>
+        </w:tc>
+        <w:tc>
+          <w:tcPr>
+            <w:tcW w:type="dxa" w:w="1728"/>
+          </w:tcPr>
+          <w:p>
+            <w:pPr>
+              <w:spacing w:line="240" w:lineRule="auto" w:after="20" w:before="20"/>
+              <w:jc w:val="center"/>
+            </w:pPr>
+            <w:r/>
+            <w:r>
+              <w:rPr>
+                <w:b w:val="0"/>
+                <w:i w:val="0"/>
+                <w:sz w:val="18"/>
+              </w:rPr>
+              <w:t>3,639</w:t>
+            </w:r>
+          </w:p>
+        </w:tc>
+        <w:tc>
+          <w:tcPr>
+            <w:tcW w:type="dxa" w:w="2304"/>
+          </w:tcPr>
+          <w:p>
+            <w:pPr>
+              <w:spacing w:line="240" w:lineRule="auto" w:after="20" w:before="20"/>
+              <w:jc w:val="center"/>
+            </w:pPr>
+            <w:r/>
+            <w:r>
+              <w:rPr>
+                <w:b w:val="0"/>
+                <w:i w:val="0"/>
+                <w:sz w:val="18"/>
+              </w:rPr>
+              <w:t>3,219–4,039</w:t>
+            </w:r>
+          </w:p>
+        </w:tc>
+      </w:tr>
+      <w:tr>
+        <w:tc>
+          <w:tcPr>
+            <w:tcW w:type="dxa" w:w="3168"/>
+          </w:tcPr>
+          <w:p>
+            <w:pPr>
+              <w:spacing w:line="240" w:lineRule="auto" w:after="20" w:before="20"/>
+            </w:pPr>
+            <w:r/>
+            <w:r>
+              <w:rPr>
+                <w:b w:val="0"/>
+                <w:i w:val="0"/>
+                <w:sz w:val="18"/>
+              </w:rPr>
+              <w:t>Claude Sonnet 5.5</w:t>
+            </w:r>
+          </w:p>
+        </w:tc>
+        <w:tc>
+          <w:tcPr>
+            <w:tcW w:type="dxa" w:w="2736"/>
+          </w:tcPr>
+          <w:p>
+            <w:pPr>
+              <w:spacing w:line="240" w:lineRule="auto" w:after="20" w:before="20"/>
+              <w:jc w:val="center"/>
+            </w:pPr>
+            <w:r/>
+            <w:r>
+              <w:rPr>
+                <w:b w:val="0"/>
+                <w:i w:val="0"/>
+                <w:sz w:val="18"/>
+              </w:rPr>
+              <w:t>151</w:t>
+            </w:r>
+          </w:p>
+        </w:tc>
+        <w:tc>
+          <w:tcPr>
+            <w:tcW w:type="dxa" w:w="1728"/>
+          </w:tcPr>
+          <w:p>
+            <w:pPr>
+              <w:spacing w:line="240" w:lineRule="auto" w:after="20" w:before="20"/>
+              <w:jc w:val="center"/>
+            </w:pPr>
+            <w:r/>
+            <w:r>
+              <w:rPr>
+                <w:b w:val="0"/>
+                <w:i w:val="0"/>
+                <w:sz w:val="18"/>
+              </w:rPr>
+              <w:t>3,476</w:t>
+            </w:r>
+          </w:p>
+        </w:tc>
+        <w:tc>
+          <w:tcPr>
+            <w:tcW w:type="dxa" w:w="2304"/>
+          </w:tcPr>
+          <w:p>
+            <w:pPr>
+              <w:spacing w:line="240" w:lineRule="auto" w:after="20" w:before="20"/>
+              <w:jc w:val="center"/>
+            </w:pPr>
+            <w:r/>
+            <w:r>
+              <w:rPr>
+                <w:b w:val="0"/>
+                <w:i w:val="0"/>
+                <w:sz w:val="18"/>
+              </w:rPr>
+              <w:t>3,252–3,684</w:t>
+            </w:r>
+          </w:p>
+        </w:tc>
+      </w:tr>
+      <w:tr>
+        <w:tc>
+          <w:tcPr>
+            <w:tcW w:type="dxa" w:w="3168"/>
+            <w:tcBorders>
+              <w:bottom w:val="single" w:sz="12" w:color="000000"/>
+            </w:tcBorders>
+          </w:tcPr>
+          <w:p>
+            <w:pPr>
+              <w:spacing w:line="240" w:lineRule="auto" w:after="20" w:before="20"/>
+            </w:pPr>
+            <w:r/>
+            <w:r>
+              <w:rPr>
+                <w:b w:val="0"/>
+                <w:i w:val="0"/>
+                <w:sz w:val="18"/>
+              </w:rPr>
+              <w:t>Llama 3.3 70B Instruct</w:t>
+            </w:r>
+          </w:p>
+        </w:tc>
+        <w:tc>
+          <w:tcPr>
+            <w:tcW w:type="dxa" w:w="2736"/>
+            <w:tcBorders>
+              <w:bottom w:val="single" w:sz="12" w:color="000000"/>
+            </w:tcBorders>
+          </w:tcPr>
+          <w:p>
+            <w:pPr>
+              <w:spacing w:line="240" w:lineRule="auto" w:after="20" w:before="20"/>
+              <w:jc w:val="center"/>
+            </w:pPr>
+            <w:r/>
+            <w:r>
+              <w:rPr>
+                <w:b w:val="0"/>
+                <w:i w:val="0"/>
+                <w:sz w:val="18"/>
+              </w:rPr>
+              <w:t>202</w:t>
+            </w:r>
+          </w:p>
+        </w:tc>
+        <w:tc>
+          <w:tcPr>
+            <w:tcW w:type="dxa" w:w="1728"/>
+            <w:tcBorders>
+              <w:bottom w:val="single" w:sz="12" w:color="000000"/>
+            </w:tcBorders>
+          </w:tcPr>
+          <w:p>
+            <w:pPr>
+              <w:spacing w:line="240" w:lineRule="auto" w:after="20" w:before="20"/>
+              <w:jc w:val="center"/>
+            </w:pPr>
+            <w:r/>
+            <w:r>
+              <w:rPr>
+                <w:b w:val="0"/>
+                <w:i w:val="0"/>
+                <w:sz w:val="18"/>
+              </w:rPr>
+              <w:t>3,002</w:t>
+            </w:r>
+          </w:p>
+        </w:tc>
+        <w:tc>
+          <w:tcPr>
+            <w:tcW w:type="dxa" w:w="2304"/>
+            <w:tcBorders>
+              <w:bottom w:val="single" w:sz="12" w:color="000000"/>
+            </w:tcBorders>
+          </w:tcPr>
+          <w:p>
+            <w:pPr>
+              <w:spacing w:line="240" w:lineRule="auto" w:after="20" w:before="20"/>
+              <w:jc w:val="center"/>
+            </w:pPr>
+            <w:r/>
+            <w:r>
+              <w:rPr>
+                <w:b w:val="0"/>
+                <w:i w:val="0"/>
+                <w:sz w:val="18"/>
+              </w:rPr>
+              <w:t>2,595–3,813</w:t>
+            </w:r>
+          </w:p>
+        </w:tc>
+      </w:tr>
+    </w:tbl>
+    <w:p>
+      <w:pPr>
+        <w:spacing w:line="240" w:lineRule="auto" w:after="160" w:before="60"/>
+      </w:pPr>
+      <w:r>
+        <w:rPr>
+          <w:b w:val="0"/>
+          <w:i w:val="0"/>
+          <w:sz w:val="18"/>
+        </w:rPr>
+        <w:t>Human length statistics are for all 500 collected papers; machine papers are those that passed the feature filter. Claude papers were capped to limit cost.</w:t>
       </w:r>
     </w:p>
     <w:p>
@@ -3210,7 +4003,7 @@
           <w:i w:val="0"/>
           <w:vertAlign w:val="superscript"/>
         </w:rPr>
-        <w:t>5</w:t>
+        <w:t>11</w:t>
       </w:r>
       <w:r>
         <w:rPr>
@@ -3250,7 +4043,7 @@
           <w:i w:val="0"/>
           <w:vertAlign w:val="superscript"/>
         </w:rPr>
-        <w:t>3</w:t>
+        <w:t>12</w:t>
       </w:r>
       <w:r>
         <w:rPr>
@@ -3272,7 +4065,22 @@
           <w:b w:val="0"/>
           <w:i w:val="0"/>
         </w:rPr>
-        <w:t xml:space="preserve"> were computed with Falcon-7B and Falcon-7B-instruct on the first 1,024 tokens of each document. The TF-IDF classifier uses word unigrams and bigrams (at most 100,000 features, logistic regression, C = 3). The RoBERTa classifier is roberta-base fine-tuned for two epochs (maximum length 512, learning rate 2e-5). For each target generator the supervised classifiers were trained on human papers outside the evaluation sample and papers of the other two generators, excluding Llama papers as training data when Llama was the attacker and excluding papers sharing a source with the evaluation sample. The judge prompt asks Gemini 2.5 Pro (temperature 0, up to 8,000 output tokens; zero-shot judging after ref. 4) for the probability from 0 to 100 that an excerpt was written by an AI model; excerpts were the first 2,000 tokens with markdown removed.</w:t>
+        <w:t xml:space="preserve"> were computed with Falcon-7B and Falcon-7B-instruct on the first 1,024 tokens of each document. The TF-IDF classifier uses word unigrams and bigrams (at most 100,000 features, logistic regression, C = 3). The RoBERTa classifier is roberta-base fine-tuned for two epochs (maximum length 512, learning rate 2e-5). For each target generator the supervised classifiers were trained on human papers outside the evaluation sample and papers of the other two generators, excluding Llama papers as training data when Llama was the attacker and excluding papers sharing a source with the evaluation sample. The judge prompt asks Gemini 2.5 Pro (temperature 0, up to 8,000 output tokens; zero-shot judging as in </w:t>
+      </w:r>
+      <w:r>
+        <w:rPr>
+          <w:b w:val="0"/>
+          <w:i w:val="0"/>
+          <w:vertAlign w:val="superscript"/>
+        </w:rPr>
+        <w:t>13</w:t>
+      </w:r>
+      <w:r>
+        <w:rPr>
+          <w:b w:val="0"/>
+          <w:i w:val="0"/>
+        </w:rPr>
+        <w:t>) for the probability from 0 to 100 that an excerpt was written by an AI model; excerpts were the first 2,000 tokens with markdown removed.</w:t>
       </w:r>
     </w:p>
     <w:p>
@@ -3298,6 +4106,46 @@
           <w:i w:val="0"/>
         </w:rPr>
         <w:t>Attacks were applied to 100 papers per generator. The feature edit moves counts of five events toward the human mean in two of four windows. The LLM rewrite asks Llama 3.3 70B to rewrite each paper so that it reads as if written by an experienced researcher; the hybrid applies the edit to the rewrite; the second rewrite repeats the rewrite. Sentence mixing replaces 50% of the sentences with sentences from human papers of the same field (not among the negatives); typo noise gives each word of at least four letters a random swap, deletion or repetition of a letter with probability 10%. The count screens, TF-IDF and RoBERTa were never trained on attacked text. All AUCs compare 200 unattacked human papers with the attacked machine papers of one generator. The artifact control uses five-fold cross-validation grouped by source paper and a held-out-generator protocol.</w:t>
+      </w:r>
+    </w:p>
+    <w:p>
+      <w:pPr>
+        <w:keepNext/>
+        <w:spacing w:line="276" w:lineRule="auto" w:after="80" w:before="160"/>
+      </w:pPr>
+      <w:r>
+        <w:rPr>
+          <w:b/>
+          <w:i/>
+        </w:rPr>
+        <w:t>Statistics</w:t>
+      </w:r>
+    </w:p>
+    <w:p>
+      <w:pPr>
+        <w:spacing w:after="0" w:before="0"/>
+      </w:pPr>
+      <w:r>
+        <w:rPr>
+          <w:b w:val="0"/>
+          <w:i w:val="0"/>
+        </w:rPr>
+        <w:t>Each cell of Table 2 and Fig. 1 compares 100 attacked machine papers with 200 unattacked human papers. The standard error of an AUC for these sample sizes</w:t>
+      </w:r>
+      <w:r>
+        <w:rPr>
+          <w:b w:val="0"/>
+          <w:i w:val="0"/>
+          <w:vertAlign w:val="superscript"/>
+        </w:rPr>
+        <w:t>14</w:t>
+      </w:r>
+      <w:r>
+        <w:rPr>
+          <w:b w:val="0"/>
+          <w:i w:val="0"/>
+        </w:rPr>
+        <w:t xml:space="preserve"> is 0.035 at AUC 0.60, 0.032 at 0.75, 0.022 at 0.90 and 0.012 at 0.97, so 95% intervals have half-widths of about 0.02 to 0.07. We therefore do not interpret differences smaller than about 0.07 between two methods or two conditions. Intervals for the clean count-screen results in Supplementary Tables 4 to 6 are bootstrap intervals over documents with folds grouped by source paper. Per-document scores of the supervised classifiers and the count screens on attacked text were not retained, so no bootstrap intervals are given for those cells.</w:t>
       </w:r>
     </w:p>
     <w:p>
@@ -3514,23 +4362,7 @@
           <w:i w:val="0"/>
           <w:sz w:val="20"/>
         </w:rPr>
-        <w:t xml:space="preserve">3. Hans, A. et al. Spotting LLMs with Binoculars: zero-shot detection of machine-generated text. In </w:t>
-      </w:r>
-      <w:r>
-        <w:rPr>
-          <w:b w:val="0"/>
-          <w:i/>
-          <w:sz w:val="20"/>
-        </w:rPr>
-        <w:t>Proc. 41st Int. Conf. Machine Learning</w:t>
-      </w:r>
-      <w:r>
-        <w:rPr>
-          <w:b w:val="0"/>
-          <w:i w:val="0"/>
-          <w:sz w:val="20"/>
-        </w:rPr>
-        <w:t xml:space="preserve"> (PMLR, 2024).</w:t>
+        <w:t>3. Sadasivan, V. S., Kumar, A., Balasubramanian, S., Wang, W. &amp; Feizi, S. Can AI-generated text be reliably detected? Preprint at https://arxiv.org/abs/2303.11156 (2023).</w:t>
       </w:r>
     </w:p>
     <w:p>
@@ -3544,7 +4376,7 @@
           <w:i w:val="0"/>
           <w:sz w:val="20"/>
         </w:rPr>
-        <w:t xml:space="preserve">4. Zheng, L. et al. Judging LLM-as-a-judge with MT-Bench and Chatbot Arena. In </w:t>
+        <w:t xml:space="preserve">4. Krishna, K., Song, Y., Karpinska, M., Wieting, J. &amp; Iyyer, M. Paraphrasing evades detectors of AI-generated text, but retrieval is an effective defense. In </w:t>
       </w:r>
       <w:r>
         <w:rPr>
@@ -3590,7 +4422,203 @@
           <w:i w:val="0"/>
           <w:sz w:val="20"/>
         </w:rPr>
-        <w:t xml:space="preserve">5. Cameron, A. C. &amp; Trivedi, P. K. </w:t>
+        <w:t xml:space="preserve">5. Li, Y. et al. MAGE: machine-generated text detection in the wild. In </w:t>
+      </w:r>
+      <w:r>
+        <w:rPr>
+          <w:b w:val="0"/>
+          <w:i/>
+          <w:sz w:val="20"/>
+        </w:rPr>
+        <w:t>Proc. 62nd Annu. Meet. Assoc. Computational Linguistics</w:t>
+      </w:r>
+      <w:r>
+        <w:rPr>
+          <w:b w:val="0"/>
+          <w:i w:val="0"/>
+          <w:sz w:val="20"/>
+        </w:rPr>
+        <w:t xml:space="preserve"> 36–53 (ACL, 2024).</w:t>
+      </w:r>
+    </w:p>
+    <w:p>
+      <w:pPr>
+        <w:spacing w:line="276" w:lineRule="auto" w:after="60"/>
+        <w:ind w:left="576" w:hanging="576"/>
+      </w:pPr>
+      <w:r>
+        <w:rPr>
+          <w:b w:val="0"/>
+          <w:i w:val="0"/>
+          <w:sz w:val="20"/>
+        </w:rPr>
+        <w:t xml:space="preserve">6. Dugan, L. et al. RAID: a shared benchmark for robust evaluation of machine-generated text detectors. In </w:t>
+      </w:r>
+      <w:r>
+        <w:rPr>
+          <w:b w:val="0"/>
+          <w:i/>
+          <w:sz w:val="20"/>
+        </w:rPr>
+        <w:t>Proc. 62nd Annu. Meet. Assoc. Computational Linguistics</w:t>
+      </w:r>
+      <w:r>
+        <w:rPr>
+          <w:b w:val="0"/>
+          <w:i w:val="0"/>
+          <w:sz w:val="20"/>
+        </w:rPr>
+        <w:t xml:space="preserve"> 12463–12492 (ACL, 2024).</w:t>
+      </w:r>
+    </w:p>
+    <w:p>
+      <w:pPr>
+        <w:spacing w:line="276" w:lineRule="auto" w:after="60"/>
+        <w:ind w:left="576" w:hanging="576"/>
+      </w:pPr>
+      <w:r>
+        <w:rPr>
+          <w:b w:val="0"/>
+          <w:i w:val="0"/>
+          <w:sz w:val="20"/>
+        </w:rPr>
+        <w:t xml:space="preserve">7. Liang, W., Yuksekgonul, M., Mao, Y., Wu, E. &amp; Zou, J. GPT detectors are biased against non-native English writers. </w:t>
+      </w:r>
+      <w:r>
+        <w:rPr>
+          <w:b w:val="0"/>
+          <w:i/>
+          <w:sz w:val="20"/>
+        </w:rPr>
+        <w:t>Patterns</w:t>
+      </w:r>
+      <w:r>
+        <w:rPr>
+          <w:b w:val="0"/>
+          <w:i w:val="0"/>
+          <w:sz w:val="20"/>
+        </w:rPr>
+        <w:t xml:space="preserve"> </w:t>
+      </w:r>
+      <w:r>
+        <w:rPr>
+          <w:b/>
+          <w:i w:val="0"/>
+          <w:sz w:val="20"/>
+        </w:rPr>
+        <w:t>4</w:t>
+      </w:r>
+      <w:r>
+        <w:rPr>
+          <w:b w:val="0"/>
+          <w:i w:val="0"/>
+          <w:sz w:val="20"/>
+        </w:rPr>
+        <w:t>, 100779 (2023).</w:t>
+      </w:r>
+    </w:p>
+    <w:p>
+      <w:pPr>
+        <w:spacing w:line="276" w:lineRule="auto" w:after="60"/>
+        <w:ind w:left="576" w:hanging="576"/>
+      </w:pPr>
+      <w:r>
+        <w:rPr>
+          <w:b w:val="0"/>
+          <w:i w:val="0"/>
+          <w:sz w:val="20"/>
+        </w:rPr>
+        <w:t xml:space="preserve">8. Kirchenbauer, J. et al. A watermark for large language models. In </w:t>
+      </w:r>
+      <w:r>
+        <w:rPr>
+          <w:b w:val="0"/>
+          <w:i/>
+          <w:sz w:val="20"/>
+        </w:rPr>
+        <w:t>Proc. 40th Int. Conf. Machine Learning</w:t>
+      </w:r>
+      <w:r>
+        <w:rPr>
+          <w:b w:val="0"/>
+          <w:i w:val="0"/>
+          <w:sz w:val="20"/>
+        </w:rPr>
+        <w:t xml:space="preserve"> 17061–17084 (PMLR, 2023).</w:t>
+      </w:r>
+    </w:p>
+    <w:p>
+      <w:pPr>
+        <w:spacing w:line="276" w:lineRule="auto" w:after="60"/>
+        <w:ind w:left="576" w:hanging="576"/>
+      </w:pPr>
+      <w:r>
+        <w:rPr>
+          <w:b w:val="0"/>
+          <w:i w:val="0"/>
+          <w:sz w:val="20"/>
+        </w:rPr>
+        <w:t>9. Liang, W. et al. Mapping the increasing use of LLMs in scientific papers. Preprint at https://arxiv.org/abs/2404.01268 (2024).</w:t>
+      </w:r>
+    </w:p>
+    <w:p>
+      <w:pPr>
+        <w:spacing w:line="276" w:lineRule="auto" w:after="60"/>
+        <w:ind w:left="576" w:hanging="576"/>
+      </w:pPr>
+      <w:r>
+        <w:rPr>
+          <w:b w:val="0"/>
+          <w:i w:val="0"/>
+          <w:sz w:val="20"/>
+        </w:rPr>
+        <w:t xml:space="preserve">10. Fröhling, L. &amp; Zubiaga, A. Feature-based detection of automated language models: tackling GPT-2, GPT-3 and Grover. </w:t>
+      </w:r>
+      <w:r>
+        <w:rPr>
+          <w:b w:val="0"/>
+          <w:i/>
+          <w:sz w:val="20"/>
+        </w:rPr>
+        <w:t>PeerJ Comput. Sci.</w:t>
+      </w:r>
+      <w:r>
+        <w:rPr>
+          <w:b w:val="0"/>
+          <w:i w:val="0"/>
+          <w:sz w:val="20"/>
+        </w:rPr>
+        <w:t xml:space="preserve"> </w:t>
+      </w:r>
+      <w:r>
+        <w:rPr>
+          <w:b/>
+          <w:i w:val="0"/>
+          <w:sz w:val="20"/>
+        </w:rPr>
+        <w:t>7</w:t>
+      </w:r>
+      <w:r>
+        <w:rPr>
+          <w:b w:val="0"/>
+          <w:i w:val="0"/>
+          <w:sz w:val="20"/>
+        </w:rPr>
+        <w:t>, e443 (2021).</w:t>
+      </w:r>
+    </w:p>
+    <w:p>
+      <w:pPr>
+        <w:spacing w:line="276" w:lineRule="auto" w:after="60"/>
+        <w:ind w:left="576" w:hanging="576"/>
+      </w:pPr>
+      <w:r>
+        <w:rPr>
+          <w:b w:val="0"/>
+          <w:i w:val="0"/>
+          <w:sz w:val="20"/>
+        </w:rPr>
+        <w:t xml:space="preserve">11. Cameron, A. C. &amp; Trivedi, P. K. </w:t>
       </w:r>
       <w:r>
         <w:rPr>
@@ -3607,6 +4635,128 @@
           <w:sz w:val="20"/>
         </w:rPr>
         <w:t xml:space="preserve"> 2nd edn (Cambridge Univ. Press, 2013).</w:t>
+      </w:r>
+    </w:p>
+    <w:p>
+      <w:pPr>
+        <w:spacing w:line="276" w:lineRule="auto" w:after="60"/>
+        <w:ind w:left="576" w:hanging="576"/>
+      </w:pPr>
+      <w:r>
+        <w:rPr>
+          <w:b w:val="0"/>
+          <w:i w:val="0"/>
+          <w:sz w:val="20"/>
+        </w:rPr>
+        <w:t xml:space="preserve">12. Hans, A. et al. Spotting LLMs with Binoculars: zero-shot detection of machine-generated text. In </w:t>
+      </w:r>
+      <w:r>
+        <w:rPr>
+          <w:b w:val="0"/>
+          <w:i/>
+          <w:sz w:val="20"/>
+        </w:rPr>
+        <w:t>Proc. 41st Int. Conf. Machine Learning</w:t>
+      </w:r>
+      <w:r>
+        <w:rPr>
+          <w:b w:val="0"/>
+          <w:i w:val="0"/>
+          <w:sz w:val="20"/>
+        </w:rPr>
+        <w:t xml:space="preserve"> (PMLR, 2024).</w:t>
+      </w:r>
+    </w:p>
+    <w:p>
+      <w:pPr>
+        <w:spacing w:line="276" w:lineRule="auto" w:after="60"/>
+        <w:ind w:left="576" w:hanging="576"/>
+      </w:pPr>
+      <w:r>
+        <w:rPr>
+          <w:b w:val="0"/>
+          <w:i w:val="0"/>
+          <w:sz w:val="20"/>
+        </w:rPr>
+        <w:t xml:space="preserve">13. Zheng, L. et al. Judging LLM-as-a-judge with MT-Bench and Chatbot Arena. In </w:t>
+      </w:r>
+      <w:r>
+        <w:rPr>
+          <w:b w:val="0"/>
+          <w:i/>
+          <w:sz w:val="20"/>
+        </w:rPr>
+        <w:t>Adv. Neural Inf. Process. Syst.</w:t>
+      </w:r>
+      <w:r>
+        <w:rPr>
+          <w:b w:val="0"/>
+          <w:i w:val="0"/>
+          <w:sz w:val="20"/>
+        </w:rPr>
+        <w:t xml:space="preserve"> </w:t>
+      </w:r>
+      <w:r>
+        <w:rPr>
+          <w:b/>
+          <w:i w:val="0"/>
+          <w:sz w:val="20"/>
+        </w:rPr>
+        <w:t>36</w:t>
+      </w:r>
+      <w:r>
+        <w:rPr>
+          <w:b w:val="0"/>
+          <w:i w:val="0"/>
+          <w:sz w:val="20"/>
+        </w:rPr>
+        <w:t xml:space="preserve"> (2023).</w:t>
+      </w:r>
+    </w:p>
+    <w:p>
+      <w:pPr>
+        <w:spacing w:line="276" w:lineRule="auto" w:after="60"/>
+        <w:ind w:left="576" w:hanging="576"/>
+      </w:pPr>
+      <w:r>
+        <w:rPr>
+          <w:b w:val="0"/>
+          <w:i w:val="0"/>
+          <w:sz w:val="20"/>
+        </w:rPr>
+        <w:t xml:space="preserve">14. Hanley, J. A. &amp; McNeil, B. J. The meaning and use of the area under a receiver operating characteristic (ROC) curve. </w:t>
+      </w:r>
+      <w:r>
+        <w:rPr>
+          <w:b w:val="0"/>
+          <w:i/>
+          <w:sz w:val="20"/>
+        </w:rPr>
+        <w:t>Radiology</w:t>
+      </w:r>
+      <w:r>
+        <w:rPr>
+          <w:b w:val="0"/>
+          <w:i w:val="0"/>
+          <w:sz w:val="20"/>
+        </w:rPr>
+        <w:t xml:space="preserve"> </w:t>
+      </w:r>
+      <w:r>
+        <w:rPr>
+          <w:b/>
+          <w:i w:val="0"/>
+          <w:sz w:val="20"/>
+        </w:rPr>
+        <w:t>143</w:t>
+      </w:r>
+      <w:r>
+        <w:rPr>
+          <w:b w:val="0"/>
+          <w:i w:val="0"/>
+          <w:sz w:val="20"/>
+        </w:rPr>
+        <w:t>, 29–36 (1982).</w:t>
       </w:r>
     </w:p>
     <w:sectPr>

</xml_diff>